<commit_message>
Update QA Risk Plan document
</commit_message>
<xml_diff>
--- a/QA_report/QA Risk Plan.docx
+++ b/QA_report/QA Risk Plan.docx
@@ -3,9 +3,17 @@
 <w:document xmlns:wpc="http://schemas.microsoft.com/office/word/2010/wordprocessingCanvas" xmlns:cx="http://schemas.microsoft.com/office/drawing/2014/chartex" xmlns:cx1="http://schemas.microsoft.com/office/drawing/2015/9/8/chartex" xmlns:mc="http://schemas.openxmlformats.org/markup-compatibility/2006" xmlns:o="urn:schemas-microsoft-com:office:office" xmlns:r="http://schemas.openxmlformats.org/officeDocument/2006/relationships" xmlns:m="http://schemas.openxmlformats.org/officeDocument/2006/math" xmlns:v="urn:schemas-microsoft-com:vml" xmlns:wp14="http://schemas.microsoft.com/office/word/2010/wordprocessingDrawing" xmlns:wp="http://schemas.openxmlformats.org/drawingml/2006/wordprocessingDrawing" xmlns:w10="urn:schemas-microsoft-com:office:word" xmlns:w="http://schemas.openxmlformats.org/wordprocessingml/2006/main" xmlns:w14="http://schemas.microsoft.com/office/word/2010/wordml" xmlns:w15="http://schemas.microsoft.com/office/word/2012/wordml" xmlns:w16se="http://schemas.microsoft.com/office/word/2015/wordml/symex" xmlns:wpg="http://schemas.microsoft.com/office/word/2010/wordprocessingGroup" xmlns:wpi="http://schemas.microsoft.com/office/word/2010/wordprocessingInk" xmlns:wne="http://schemas.microsoft.com/office/word/2006/wordml" xmlns:wps="http://schemas.microsoft.com/office/word/2010/wordprocessingShape" mc:Ignorable="w14 w15 w16se wp14">
   <w:body>
     <w:p>
+      <w:pPr>
+        <w:jc w:val="center"/>
+      </w:pPr>
+      <w:bookmarkStart w:id="0" w:name="_GoBack"/>
       <w:r>
-        <w:t>QA Risk Report – Task Force</w:t>
+        <w:t>QA Risk Plan</w:t>
       </w:r>
+      <w:r>
+        <w:t xml:space="preserve"> – Task Force</w:t>
+      </w:r>
+      <w:bookmarkEnd w:id="0"/>
       <w:r>
         <w:br/>
       </w:r>
@@ -167,7 +175,10 @@
           </w:tcPr>
           <w:p>
             <w:r>
-              <w:t xml:space="preserve">Data is not persisting </w:t>
+              <w:t>Data</w:t>
+            </w:r>
+            <w:r>
+              <w:t xml:space="preserve"> persisting </w:t>
             </w:r>
           </w:p>
         </w:tc>
@@ -177,7 +188,7 @@
           </w:tcPr>
           <w:p>
             <w:r>
-              <w:t>High</w:t>
+              <w:t>Tasks may be lost</w:t>
             </w:r>
           </w:p>
         </w:tc>
@@ -203,10 +214,7 @@
         </w:tc>
       </w:tr>
     </w:tbl>
-    <w:p>
-      <w:bookmarkStart w:id="0" w:name="_GoBack"/>
-      <w:bookmarkEnd w:id="0"/>
-    </w:p>
+    <w:p/>
     <w:sectPr>
       <w:pgSz w:w="12240" w:h="15840"/>
       <w:pgMar w:top="1440" w:right="1440" w:bottom="1440" w:left="1440" w:header="708" w:footer="708" w:gutter="0"/>

</xml_diff>